<commit_message>
Updated Biochemistry and Enzymes
</commit_message>
<xml_diff>
--- a/Manuscript/Urchins.docx
+++ b/Manuscript/Urchins.docx
@@ -8,8 +8,8 @@
           <w:rFonts w:ascii="Futura" w:hAnsi="Futura" w:cs="Futura Medium"/>
           <w:b/>
           <w:bCs/>
-          <w:sz w:val="40"/>
-          <w:szCs w:val="40"/>
+          <w:sz w:val="32"/>
+          <w:szCs w:val="32"/>
           <w:lang w:val="en-GB"/>
         </w:rPr>
       </w:pPr>
@@ -18,8 +18,8 @@
           <w:rFonts w:ascii="Futura" w:hAnsi="Futura" w:cs="Futura Medium"/>
           <w:b/>
           <w:bCs/>
-          <w:sz w:val="40"/>
-          <w:szCs w:val="40"/>
+          <w:sz w:val="32"/>
+          <w:szCs w:val="32"/>
           <w:lang w:val="en-GB"/>
         </w:rPr>
         <w:t>Sea urchin</w:t>
@@ -29,8 +29,8 @@
           <w:rFonts w:ascii="Futura" w:hAnsi="Futura" w:cs="Futura Medium"/>
           <w:b/>
           <w:bCs/>
-          <w:sz w:val="40"/>
-          <w:szCs w:val="40"/>
+          <w:sz w:val="32"/>
+          <w:szCs w:val="32"/>
           <w:lang w:val="en-GB"/>
         </w:rPr>
         <w:t xml:space="preserve">s </w:t>
@@ -40,8 +40,8 @@
           <w:rFonts w:ascii="Futura" w:hAnsi="Futura" w:cs="Futura Medium"/>
           <w:b/>
           <w:bCs/>
-          <w:sz w:val="40"/>
-          <w:szCs w:val="40"/>
+          <w:sz w:val="32"/>
+          <w:szCs w:val="32"/>
           <w:lang w:val="en-GB"/>
         </w:rPr>
         <w:t xml:space="preserve">diminish </w:t>
@@ -51,33 +51,56 @@
           <w:rFonts w:ascii="Futura" w:hAnsi="Futura" w:cs="Futura Medium"/>
           <w:b/>
           <w:bCs/>
-          <w:sz w:val="40"/>
-          <w:szCs w:val="40"/>
-          <w:lang w:val="en-GB"/>
-        </w:rPr>
-        <w:t>kelp</w:t>
+          <w:sz w:val="32"/>
+          <w:szCs w:val="32"/>
+          <w:lang w:val="en-GB"/>
+        </w:rPr>
+        <w:t xml:space="preserve">kelp </w:t>
       </w:r>
       <w:r>
         <w:rPr>
           <w:rFonts w:ascii="Futura" w:hAnsi="Futura" w:cs="Futura Medium"/>
           <w:b/>
           <w:bCs/>
-          <w:sz w:val="40"/>
-          <w:szCs w:val="40"/>
-          <w:lang w:val="en-GB"/>
-        </w:rPr>
-        <w:t xml:space="preserve"> </w:t>
+          <w:sz w:val="32"/>
+          <w:szCs w:val="32"/>
+          <w:lang w:val="en-GB"/>
+        </w:rPr>
+        <w:t>carbon sequestration potential</w:t>
       </w:r>
       <w:r>
         <w:rPr>
           <w:rFonts w:ascii="Futura" w:hAnsi="Futura" w:cs="Futura Medium"/>
           <w:b/>
           <w:bCs/>
-          <w:sz w:val="40"/>
-          <w:szCs w:val="40"/>
-          <w:lang w:val="en-GB"/>
-        </w:rPr>
-        <w:t>carbon sequestration potential</w:t>
+          <w:sz w:val="32"/>
+          <w:szCs w:val="32"/>
+          <w:lang w:val="en-GB"/>
+        </w:rPr>
+        <w:t xml:space="preserve"> //</w:t>
+      </w:r>
+    </w:p>
+    <w:p>
+      <w:pPr>
+        <w:rPr>
+          <w:rFonts w:ascii="Futura" w:hAnsi="Futura" w:cs="Futura Medium"/>
+          <w:b/>
+          <w:bCs/>
+          <w:sz w:val="32"/>
+          <w:szCs w:val="32"/>
+          <w:lang w:val="en-GB"/>
+        </w:rPr>
+      </w:pPr>
+      <w:r>
+        <w:rPr>
+          <w:rFonts w:ascii="Futura" w:hAnsi="Futura" w:cs="Futura Medium"/>
+          <w:b/>
+          <w:bCs/>
+          <w:sz w:val="32"/>
+          <w:szCs w:val="32"/>
+          <w:lang w:val="en-GB"/>
+        </w:rPr>
+        <w:t>The role of sea urchins in the kelp carbon cycle</w:t>
       </w:r>
     </w:p>
     <w:p>
@@ -701,65 +724,225 @@
           <w:szCs w:val="22"/>
           <w:lang w:val="en-GB"/>
         </w:rPr>
-        <w:t>{Mamelona and Pelletier, 2005, #68902} turned the absorption efficiency metric on its head and claimed that most carbon passes right through.</w:t>
-      </w:r>
-    </w:p>
-    <w:p>
-      <w:pPr>
-        <w:rPr>
-          <w:rFonts w:ascii="Futura Medium" w:hAnsi="Futura Medium" w:cs="Futura Medium"/>
-          <w:sz w:val="22"/>
-          <w:szCs w:val="22"/>
-          <w:lang w:val="en-GB"/>
-        </w:rPr>
-      </w:pPr>
-    </w:p>
-    <w:p>
-      <w:pPr>
-        <w:rPr>
-          <w:rFonts w:ascii="Futura Medium" w:hAnsi="Futura Medium" w:cs="Futura Medium"/>
-          <w:sz w:val="22"/>
-          <w:szCs w:val="22"/>
-          <w:lang w:val="en-GB"/>
-        </w:rPr>
-      </w:pPr>
-      <w:r>
-        <w:rPr>
-          <w:rFonts w:ascii="Futura Medium" w:hAnsi="Futura Medium" w:cs="Futura Medium" w:hint="cs"/>
-          <w:sz w:val="22"/>
-          <w:szCs w:val="22"/>
-          <w:lang w:val="en-GB"/>
-        </w:rPr>
-        <w:t>Other authors showed sinking speed differences which was used by {Sauchyn and Scheibling, 2009, #82871; Sauchyn et al., 2011, #41587; Sauchyn and Scheibling, 2009, #84657}</w:t>
-      </w:r>
-    </w:p>
-    <w:p>
-      <w:pPr>
-        <w:rPr>
-          <w:rFonts w:ascii="Futura Medium" w:hAnsi="Futura Medium" w:cs="Futura Medium"/>
-          <w:sz w:val="22"/>
-          <w:szCs w:val="22"/>
-          <w:lang w:val="en-GB"/>
-        </w:rPr>
-      </w:pPr>
-    </w:p>
-    <w:p>
-      <w:pPr>
-        <w:rPr>
-          <w:rFonts w:ascii="Futura Medium" w:hAnsi="Futura Medium" w:cs="Futura Medium"/>
-          <w:sz w:val="22"/>
-          <w:szCs w:val="22"/>
-          <w:lang w:val="en-GB"/>
-        </w:rPr>
-      </w:pPr>
-      <w:r>
-        <w:rPr>
-          <w:rFonts w:ascii="Futura Medium" w:hAnsi="Futura Medium" w:cs="Futura Medium" w:hint="cs"/>
-          <w:sz w:val="22"/>
-          <w:szCs w:val="22"/>
-          <w:lang w:val="en-GB"/>
-        </w:rPr>
-        <w:t>Inspired by this, {Wernberg and Filbee-Dexter, 2018, #97898} measured more sinking speed differences which were used by {Filbee-Dexter et al., 2020, #86459} to conclude that urchins enhance kelp carbon sequestration potential.</w:t>
+        <w:t>{</w:t>
+      </w:r>
+      <w:proofErr w:type="spellStart"/>
+      <w:r>
+        <w:rPr>
+          <w:rFonts w:ascii="Futura Medium" w:hAnsi="Futura Medium" w:cs="Futura Medium" w:hint="cs"/>
+          <w:sz w:val="22"/>
+          <w:szCs w:val="22"/>
+          <w:lang w:val="en-GB"/>
+        </w:rPr>
+        <w:t>Mamelona</w:t>
+      </w:r>
+      <w:proofErr w:type="spellEnd"/>
+      <w:r>
+        <w:rPr>
+          <w:rFonts w:ascii="Futura Medium" w:hAnsi="Futura Medium" w:cs="Futura Medium" w:hint="cs"/>
+          <w:sz w:val="22"/>
+          <w:szCs w:val="22"/>
+          <w:lang w:val="en-GB"/>
+        </w:rPr>
+        <w:t xml:space="preserve"> and Pelletier, 2005, #68902} turned the absorption efficiency metric on its head and claimed that most carbon passes right through.</w:t>
+      </w:r>
+    </w:p>
+    <w:p>
+      <w:pPr>
+        <w:rPr>
+          <w:rFonts w:ascii="Futura Medium" w:hAnsi="Futura Medium" w:cs="Futura Medium"/>
+          <w:sz w:val="22"/>
+          <w:szCs w:val="22"/>
+          <w:lang w:val="en-GB"/>
+        </w:rPr>
+      </w:pPr>
+    </w:p>
+    <w:p>
+      <w:pPr>
+        <w:rPr>
+          <w:rFonts w:ascii="Futura Medium" w:hAnsi="Futura Medium" w:cs="Futura Medium"/>
+          <w:sz w:val="22"/>
+          <w:szCs w:val="22"/>
+          <w:lang w:val="en-GB"/>
+        </w:rPr>
+      </w:pPr>
+      <w:r>
+        <w:rPr>
+          <w:rFonts w:ascii="Futura Medium" w:hAnsi="Futura Medium" w:cs="Futura Medium" w:hint="cs"/>
+          <w:sz w:val="22"/>
+          <w:szCs w:val="22"/>
+          <w:lang w:val="en-GB"/>
+        </w:rPr>
+        <w:t>Other authors showed sinking speed differences which was used by {</w:t>
+      </w:r>
+      <w:proofErr w:type="spellStart"/>
+      <w:r>
+        <w:rPr>
+          <w:rFonts w:ascii="Futura Medium" w:hAnsi="Futura Medium" w:cs="Futura Medium" w:hint="cs"/>
+          <w:sz w:val="22"/>
+          <w:szCs w:val="22"/>
+          <w:lang w:val="en-GB"/>
+        </w:rPr>
+        <w:t>Sauchyn</w:t>
+      </w:r>
+      <w:proofErr w:type="spellEnd"/>
+      <w:r>
+        <w:rPr>
+          <w:rFonts w:ascii="Futura Medium" w:hAnsi="Futura Medium" w:cs="Futura Medium" w:hint="cs"/>
+          <w:sz w:val="22"/>
+          <w:szCs w:val="22"/>
+          <w:lang w:val="en-GB"/>
+        </w:rPr>
+        <w:t xml:space="preserve"> and </w:t>
+      </w:r>
+      <w:proofErr w:type="spellStart"/>
+      <w:r>
+        <w:rPr>
+          <w:rFonts w:ascii="Futura Medium" w:hAnsi="Futura Medium" w:cs="Futura Medium" w:hint="cs"/>
+          <w:sz w:val="22"/>
+          <w:szCs w:val="22"/>
+          <w:lang w:val="en-GB"/>
+        </w:rPr>
+        <w:t>Scheibling</w:t>
+      </w:r>
+      <w:proofErr w:type="spellEnd"/>
+      <w:r>
+        <w:rPr>
+          <w:rFonts w:ascii="Futura Medium" w:hAnsi="Futura Medium" w:cs="Futura Medium" w:hint="cs"/>
+          <w:sz w:val="22"/>
+          <w:szCs w:val="22"/>
+          <w:lang w:val="en-GB"/>
+        </w:rPr>
+        <w:t xml:space="preserve">, 2009, #82871; </w:t>
+      </w:r>
+      <w:proofErr w:type="spellStart"/>
+      <w:r>
+        <w:rPr>
+          <w:rFonts w:ascii="Futura Medium" w:hAnsi="Futura Medium" w:cs="Futura Medium" w:hint="cs"/>
+          <w:sz w:val="22"/>
+          <w:szCs w:val="22"/>
+          <w:lang w:val="en-GB"/>
+        </w:rPr>
+        <w:t>Sauchyn</w:t>
+      </w:r>
+      <w:proofErr w:type="spellEnd"/>
+      <w:r>
+        <w:rPr>
+          <w:rFonts w:ascii="Futura Medium" w:hAnsi="Futura Medium" w:cs="Futura Medium" w:hint="cs"/>
+          <w:sz w:val="22"/>
+          <w:szCs w:val="22"/>
+          <w:lang w:val="en-GB"/>
+        </w:rPr>
+        <w:t xml:space="preserve"> et al., 2011, #41587; </w:t>
+      </w:r>
+      <w:proofErr w:type="spellStart"/>
+      <w:r>
+        <w:rPr>
+          <w:rFonts w:ascii="Futura Medium" w:hAnsi="Futura Medium" w:cs="Futura Medium" w:hint="cs"/>
+          <w:sz w:val="22"/>
+          <w:szCs w:val="22"/>
+          <w:lang w:val="en-GB"/>
+        </w:rPr>
+        <w:t>Sauchyn</w:t>
+      </w:r>
+      <w:proofErr w:type="spellEnd"/>
+      <w:r>
+        <w:rPr>
+          <w:rFonts w:ascii="Futura Medium" w:hAnsi="Futura Medium" w:cs="Futura Medium" w:hint="cs"/>
+          <w:sz w:val="22"/>
+          <w:szCs w:val="22"/>
+          <w:lang w:val="en-GB"/>
+        </w:rPr>
+        <w:t xml:space="preserve"> and </w:t>
+      </w:r>
+      <w:proofErr w:type="spellStart"/>
+      <w:r>
+        <w:rPr>
+          <w:rFonts w:ascii="Futura Medium" w:hAnsi="Futura Medium" w:cs="Futura Medium" w:hint="cs"/>
+          <w:sz w:val="22"/>
+          <w:szCs w:val="22"/>
+          <w:lang w:val="en-GB"/>
+        </w:rPr>
+        <w:t>Scheibling</w:t>
+      </w:r>
+      <w:proofErr w:type="spellEnd"/>
+      <w:r>
+        <w:rPr>
+          <w:rFonts w:ascii="Futura Medium" w:hAnsi="Futura Medium" w:cs="Futura Medium" w:hint="cs"/>
+          <w:sz w:val="22"/>
+          <w:szCs w:val="22"/>
+          <w:lang w:val="en-GB"/>
+        </w:rPr>
+        <w:t>, 2009, #84657}</w:t>
+      </w:r>
+    </w:p>
+    <w:p>
+      <w:pPr>
+        <w:rPr>
+          <w:rFonts w:ascii="Futura Medium" w:hAnsi="Futura Medium" w:cs="Futura Medium"/>
+          <w:sz w:val="22"/>
+          <w:szCs w:val="22"/>
+          <w:lang w:val="en-GB"/>
+        </w:rPr>
+      </w:pPr>
+    </w:p>
+    <w:p>
+      <w:pPr>
+        <w:rPr>
+          <w:rFonts w:ascii="Futura Medium" w:hAnsi="Futura Medium" w:cs="Futura Medium"/>
+          <w:sz w:val="22"/>
+          <w:szCs w:val="22"/>
+          <w:lang w:val="en-GB"/>
+        </w:rPr>
+      </w:pPr>
+      <w:r>
+        <w:rPr>
+          <w:rFonts w:ascii="Futura Medium" w:hAnsi="Futura Medium" w:cs="Futura Medium" w:hint="cs"/>
+          <w:sz w:val="22"/>
+          <w:szCs w:val="22"/>
+          <w:lang w:val="en-GB"/>
+        </w:rPr>
+        <w:t xml:space="preserve">Inspired by this, {Wernberg and </w:t>
+      </w:r>
+      <w:proofErr w:type="spellStart"/>
+      <w:r>
+        <w:rPr>
+          <w:rFonts w:ascii="Futura Medium" w:hAnsi="Futura Medium" w:cs="Futura Medium" w:hint="cs"/>
+          <w:sz w:val="22"/>
+          <w:szCs w:val="22"/>
+          <w:lang w:val="en-GB"/>
+        </w:rPr>
+        <w:t>Filbee</w:t>
+      </w:r>
+      <w:proofErr w:type="spellEnd"/>
+      <w:r>
+        <w:rPr>
+          <w:rFonts w:ascii="Futura Medium" w:hAnsi="Futura Medium" w:cs="Futura Medium" w:hint="cs"/>
+          <w:sz w:val="22"/>
+          <w:szCs w:val="22"/>
+          <w:lang w:val="en-GB"/>
+        </w:rPr>
+        <w:t>-Dexter, 2018, #97898} measured more sinking speed differences which were used by {</w:t>
+      </w:r>
+      <w:proofErr w:type="spellStart"/>
+      <w:r>
+        <w:rPr>
+          <w:rFonts w:ascii="Futura Medium" w:hAnsi="Futura Medium" w:cs="Futura Medium" w:hint="cs"/>
+          <w:sz w:val="22"/>
+          <w:szCs w:val="22"/>
+          <w:lang w:val="en-GB"/>
+        </w:rPr>
+        <w:t>Filbee</w:t>
+      </w:r>
+      <w:proofErr w:type="spellEnd"/>
+      <w:r>
+        <w:rPr>
+          <w:rFonts w:ascii="Futura Medium" w:hAnsi="Futura Medium" w:cs="Futura Medium" w:hint="cs"/>
+          <w:sz w:val="22"/>
+          <w:szCs w:val="22"/>
+          <w:lang w:val="en-GB"/>
+        </w:rPr>
+        <w:t>-Dexter et al., 2020, #86459} to conclude that urchins enhance kelp carbon sequestration potential.</w:t>
       </w:r>
     </w:p>
     <w:p>
@@ -876,17 +1059,9 @@
           <w:szCs w:val="22"/>
           <w:lang w:val="en-GB"/>
         </w:rPr>
-        <w:t>Strongylocentrotus droebachiensis</w:t>
-      </w:r>
-      <w:r>
-        <w:rPr>
-          <w:rFonts w:ascii="Futura Medium" w:hAnsi="Futura Medium" w:cs="Futura Medium" w:hint="cs"/>
-          <w:sz w:val="22"/>
-          <w:szCs w:val="22"/>
-          <w:lang w:val="en-GB"/>
-        </w:rPr>
-        <w:t xml:space="preserve">) were collected from Telegrafbukta, Tromsø, placed in flow-through tanks and left to acclimatise for days. They were fed </w:t>
-      </w:r>
+        <w:t xml:space="preserve">Strongylocentrotus </w:t>
+      </w:r>
+      <w:proofErr w:type="spellStart"/>
       <w:r>
         <w:rPr>
           <w:rFonts w:ascii="Futura Medium" w:hAnsi="Futura Medium" w:cs="Futura Medium" w:hint="cs"/>
@@ -896,16 +1071,37 @@
           <w:szCs w:val="22"/>
           <w:lang w:val="en-GB"/>
         </w:rPr>
-        <w:t>ad libitum</w:t>
-      </w:r>
-      <w:r>
-        <w:rPr>
-          <w:rFonts w:ascii="Futura Medium" w:hAnsi="Futura Medium" w:cs="Futura Medium" w:hint="cs"/>
-          <w:sz w:val="22"/>
-          <w:szCs w:val="22"/>
-          <w:lang w:val="en-GB"/>
-        </w:rPr>
-        <w:t xml:space="preserve"> with fresh </w:t>
+        <w:t>droebachiensis</w:t>
+      </w:r>
+      <w:proofErr w:type="spellEnd"/>
+      <w:r>
+        <w:rPr>
+          <w:rFonts w:ascii="Futura Medium" w:hAnsi="Futura Medium" w:cs="Futura Medium" w:hint="cs"/>
+          <w:sz w:val="22"/>
+          <w:szCs w:val="22"/>
+          <w:lang w:val="en-GB"/>
+        </w:rPr>
+        <w:t xml:space="preserve">) were collected from </w:t>
+      </w:r>
+      <w:proofErr w:type="spellStart"/>
+      <w:r>
+        <w:rPr>
+          <w:rFonts w:ascii="Futura Medium" w:hAnsi="Futura Medium" w:cs="Futura Medium" w:hint="cs"/>
+          <w:sz w:val="22"/>
+          <w:szCs w:val="22"/>
+          <w:lang w:val="en-GB"/>
+        </w:rPr>
+        <w:t>Telegrafbukta</w:t>
+      </w:r>
+      <w:proofErr w:type="spellEnd"/>
+      <w:r>
+        <w:rPr>
+          <w:rFonts w:ascii="Futura Medium" w:hAnsi="Futura Medium" w:cs="Futura Medium" w:hint="cs"/>
+          <w:sz w:val="22"/>
+          <w:szCs w:val="22"/>
+          <w:lang w:val="en-GB"/>
+        </w:rPr>
+        <w:t xml:space="preserve">, Tromsø, placed in flow-through tanks and left to acclimatise for days. They were fed </w:t>
       </w:r>
       <w:r>
         <w:rPr>
@@ -916,16 +1112,16 @@
           <w:szCs w:val="22"/>
           <w:lang w:val="en-GB"/>
         </w:rPr>
-        <w:t>Ascophyllum nodosum</w:t>
-      </w:r>
-      <w:r>
-        <w:rPr>
-          <w:rFonts w:ascii="Futura Medium" w:hAnsi="Futura Medium" w:cs="Futura Medium" w:hint="cs"/>
-          <w:sz w:val="22"/>
-          <w:szCs w:val="22"/>
-          <w:lang w:val="en-GB"/>
-        </w:rPr>
-        <w:t xml:space="preserve"> and then </w:t>
+        <w:t>ad libitum</w:t>
+      </w:r>
+      <w:r>
+        <w:rPr>
+          <w:rFonts w:ascii="Futura Medium" w:hAnsi="Futura Medium" w:cs="Futura Medium" w:hint="cs"/>
+          <w:sz w:val="22"/>
+          <w:szCs w:val="22"/>
+          <w:lang w:val="en-GB"/>
+        </w:rPr>
+        <w:t xml:space="preserve"> with fresh </w:t>
       </w:r>
       <w:r>
         <w:rPr>
@@ -936,16 +1132,16 @@
           <w:szCs w:val="22"/>
           <w:lang w:val="en-GB"/>
         </w:rPr>
-        <w:t>Laminaria digitata</w:t>
-      </w:r>
-      <w:r>
-        <w:rPr>
-          <w:rFonts w:ascii="Futura Medium" w:hAnsi="Futura Medium" w:cs="Futura Medium" w:hint="cs"/>
-          <w:sz w:val="22"/>
-          <w:szCs w:val="22"/>
-          <w:lang w:val="en-GB"/>
-        </w:rPr>
-        <w:t xml:space="preserve"> wrack. Urchins were then transferred to new flow-through tanks, four in each. Fresh kelp (</w:t>
+        <w:t>Ascophyllum nodosum</w:t>
+      </w:r>
+      <w:r>
+        <w:rPr>
+          <w:rFonts w:ascii="Futura Medium" w:hAnsi="Futura Medium" w:cs="Futura Medium" w:hint="cs"/>
+          <w:sz w:val="22"/>
+          <w:szCs w:val="22"/>
+          <w:lang w:val="en-GB"/>
+        </w:rPr>
+        <w:t xml:space="preserve"> and then </w:t>
       </w:r>
       <w:r>
         <w:rPr>
@@ -956,16 +1152,69 @@
           <w:szCs w:val="22"/>
           <w:lang w:val="en-GB"/>
         </w:rPr>
-        <w:t>Laminaria hyperborea</w:t>
-      </w:r>
-      <w:r>
-        <w:rPr>
-          <w:rFonts w:ascii="Futura Medium" w:hAnsi="Futura Medium" w:cs="Futura Medium" w:hint="cs"/>
-          <w:sz w:val="22"/>
-          <w:szCs w:val="22"/>
-          <w:lang w:val="en-GB"/>
-        </w:rPr>
-        <w:t>) was collected from Sommaroy and cut into segments of known buoyant mass. Sea urchins were transferred to clean flow-through tanks</w:t>
+        <w:t>Laminaria digitata</w:t>
+      </w:r>
+      <w:r>
+        <w:rPr>
+          <w:rFonts w:ascii="Futura Medium" w:hAnsi="Futura Medium" w:cs="Futura Medium" w:hint="cs"/>
+          <w:sz w:val="22"/>
+          <w:szCs w:val="22"/>
+          <w:lang w:val="en-GB"/>
+        </w:rPr>
+        <w:t xml:space="preserve"> wrack. Urchins were then transferred to new flow-through tanks, four in each. Fresh kelp (</w:t>
+      </w:r>
+      <w:r>
+        <w:rPr>
+          <w:rFonts w:ascii="Futura Medium" w:hAnsi="Futura Medium" w:cs="Futura Medium" w:hint="cs"/>
+          <w:i/>
+          <w:iCs/>
+          <w:sz w:val="22"/>
+          <w:szCs w:val="22"/>
+          <w:lang w:val="en-GB"/>
+        </w:rPr>
+        <w:t xml:space="preserve">Laminaria </w:t>
+      </w:r>
+      <w:proofErr w:type="spellStart"/>
+      <w:r>
+        <w:rPr>
+          <w:rFonts w:ascii="Futura Medium" w:hAnsi="Futura Medium" w:cs="Futura Medium" w:hint="cs"/>
+          <w:i/>
+          <w:iCs/>
+          <w:sz w:val="22"/>
+          <w:szCs w:val="22"/>
+          <w:lang w:val="en-GB"/>
+        </w:rPr>
+        <w:t>hyperborea</w:t>
+      </w:r>
+      <w:proofErr w:type="spellEnd"/>
+      <w:r>
+        <w:rPr>
+          <w:rFonts w:ascii="Futura Medium" w:hAnsi="Futura Medium" w:cs="Futura Medium" w:hint="cs"/>
+          <w:sz w:val="22"/>
+          <w:szCs w:val="22"/>
+          <w:lang w:val="en-GB"/>
+        </w:rPr>
+        <w:t xml:space="preserve">) was collected from </w:t>
+      </w:r>
+      <w:proofErr w:type="spellStart"/>
+      <w:r>
+        <w:rPr>
+          <w:rFonts w:ascii="Futura Medium" w:hAnsi="Futura Medium" w:cs="Futura Medium" w:hint="cs"/>
+          <w:sz w:val="22"/>
+          <w:szCs w:val="22"/>
+          <w:lang w:val="en-GB"/>
+        </w:rPr>
+        <w:t>Sommaroy</w:t>
+      </w:r>
+      <w:proofErr w:type="spellEnd"/>
+      <w:r>
+        <w:rPr>
+          <w:rFonts w:ascii="Futura Medium" w:hAnsi="Futura Medium" w:cs="Futura Medium" w:hint="cs"/>
+          <w:sz w:val="22"/>
+          <w:szCs w:val="22"/>
+          <w:lang w:val="en-GB"/>
+        </w:rPr>
+        <w:t xml:space="preserve"> and cut into segments of known buoyant mass. Sea urchins were transferred to clean flow-through tanks</w:t>
       </w:r>
     </w:p>
     <w:p>
@@ -1149,7 +1398,27 @@
           <w:szCs w:val="22"/>
           <w:lang w:val="en-GB"/>
         </w:rPr>
-        <w:t xml:space="preserve">{Hollertz, 2002, #61035} </w:t>
+        <w:t>{</w:t>
+      </w:r>
+      <w:proofErr w:type="spellStart"/>
+      <w:r>
+        <w:rPr>
+          <w:rFonts w:ascii="Futura Medium" w:hAnsi="Futura Medium" w:cs="Futura Medium" w:hint="cs"/>
+          <w:sz w:val="22"/>
+          <w:szCs w:val="22"/>
+          <w:lang w:val="en-GB"/>
+        </w:rPr>
+        <w:t>Hollertz</w:t>
+      </w:r>
+      <w:proofErr w:type="spellEnd"/>
+      <w:r>
+        <w:rPr>
+          <w:rFonts w:ascii="Futura Medium" w:hAnsi="Futura Medium" w:cs="Futura Medium" w:hint="cs"/>
+          <w:sz w:val="22"/>
+          <w:szCs w:val="22"/>
+          <w:lang w:val="en-GB"/>
+        </w:rPr>
+        <w:t xml:space="preserve">, 2002, #61035} </w:t>
       </w:r>
       <w:r>
         <w:rPr>
@@ -1266,7 +1535,27 @@
           <w:szCs w:val="22"/>
           <w:lang w:val="en-GB"/>
         </w:rPr>
-        <w:t xml:space="preserve">{Senaratna et al., 2005, #27141} </w:t>
+        <w:t>{</w:t>
+      </w:r>
+      <w:proofErr w:type="spellStart"/>
+      <w:r>
+        <w:rPr>
+          <w:rFonts w:ascii="Futura Medium" w:hAnsi="Futura Medium" w:cs="Futura Medium" w:hint="cs"/>
+          <w:sz w:val="22"/>
+          <w:szCs w:val="22"/>
+          <w:lang w:val="en-GB"/>
+        </w:rPr>
+        <w:t>Senaratna</w:t>
+      </w:r>
+      <w:proofErr w:type="spellEnd"/>
+      <w:r>
+        <w:rPr>
+          <w:rFonts w:ascii="Futura Medium" w:hAnsi="Futura Medium" w:cs="Futura Medium" w:hint="cs"/>
+          <w:sz w:val="22"/>
+          <w:szCs w:val="22"/>
+          <w:lang w:val="en-GB"/>
+        </w:rPr>
+        <w:t xml:space="preserve"> et al., 2005, #27141} </w:t>
       </w:r>
       <w:r>
         <w:rPr>
@@ -1284,7 +1573,27 @@
           <w:szCs w:val="22"/>
           <w:lang w:val="en-GB"/>
         </w:rPr>
-        <w:t xml:space="preserve">{Fernandez and Boudouresque, 2000, #39815} </w:t>
+        <w:t xml:space="preserve">{Fernandez and </w:t>
+      </w:r>
+      <w:proofErr w:type="spellStart"/>
+      <w:r>
+        <w:rPr>
+          <w:rFonts w:ascii="Futura Medium" w:hAnsi="Futura Medium" w:cs="Futura Medium" w:hint="cs"/>
+          <w:sz w:val="22"/>
+          <w:szCs w:val="22"/>
+          <w:lang w:val="en-GB"/>
+        </w:rPr>
+        <w:t>Boudouresque</w:t>
+      </w:r>
+      <w:proofErr w:type="spellEnd"/>
+      <w:r>
+        <w:rPr>
+          <w:rFonts w:ascii="Futura Medium" w:hAnsi="Futura Medium" w:cs="Futura Medium" w:hint="cs"/>
+          <w:sz w:val="22"/>
+          <w:szCs w:val="22"/>
+          <w:lang w:val="en-GB"/>
+        </w:rPr>
+        <w:t xml:space="preserve">, 2000, #39815} </w:t>
       </w:r>
       <w:r>
         <w:rPr>
@@ -1302,25 +1611,55 @@
           <w:szCs w:val="22"/>
           <w:lang w:val="en-GB"/>
         </w:rPr>
-        <w:t>{Lawrence et al., 2003, #70532}</w:t>
-      </w:r>
-      <w:r>
-        <w:rPr>
-          <w:rFonts w:ascii="Futura Medium" w:hAnsi="Futura Medium" w:cs="Futura Medium" w:hint="cs"/>
-          <w:sz w:val="22"/>
-          <w:szCs w:val="22"/>
-          <w:lang w:val="en-GB"/>
-        </w:rPr>
-        <w:t xml:space="preserve">or for specific elements (e.g. Propp </w:t>
-      </w:r>
-      <w:r>
-        <w:rPr>
-          <w:rFonts w:ascii="Futura Medium" w:hAnsi="Futura Medium" w:cs="Futura Medium" w:hint="cs"/>
-          <w:sz w:val="22"/>
-          <w:szCs w:val="22"/>
-          <w:lang w:val="en-GB"/>
-        </w:rPr>
-        <w:t xml:space="preserve">1977 in </w:t>
+        <w:t>{Lawrence et al., 2003, #</w:t>
+      </w:r>
+      <w:proofErr w:type="gramStart"/>
+      <w:r>
+        <w:rPr>
+          <w:rFonts w:ascii="Futura Medium" w:hAnsi="Futura Medium" w:cs="Futura Medium" w:hint="cs"/>
+          <w:sz w:val="22"/>
+          <w:szCs w:val="22"/>
+          <w:lang w:val="en-GB"/>
+        </w:rPr>
+        <w:t>70532}</w:t>
+      </w:r>
+      <w:r>
+        <w:rPr>
+          <w:rFonts w:ascii="Futura Medium" w:hAnsi="Futura Medium" w:cs="Futura Medium" w:hint="cs"/>
+          <w:sz w:val="22"/>
+          <w:szCs w:val="22"/>
+          <w:lang w:val="en-GB"/>
+        </w:rPr>
+        <w:t>or</w:t>
+      </w:r>
+      <w:proofErr w:type="gramEnd"/>
+      <w:r>
+        <w:rPr>
+          <w:rFonts w:ascii="Futura Medium" w:hAnsi="Futura Medium" w:cs="Futura Medium" w:hint="cs"/>
+          <w:sz w:val="22"/>
+          <w:szCs w:val="22"/>
+          <w:lang w:val="en-GB"/>
+        </w:rPr>
+        <w:t xml:space="preserve"> for specific elements (e.g. Propp </w:t>
+      </w:r>
+      <w:r>
+        <w:rPr>
+          <w:rFonts w:ascii="Futura Medium" w:hAnsi="Futura Medium" w:cs="Futura Medium" w:hint="cs"/>
+          <w:sz w:val="22"/>
+          <w:szCs w:val="22"/>
+          <w:lang w:val="en-GB"/>
+        </w:rPr>
+        <w:t xml:space="preserve">1977 </w:t>
+      </w:r>
+      <w:proofErr w:type="gramStart"/>
+      <w:r>
+        <w:rPr>
+          <w:rFonts w:ascii="Futura Medium" w:hAnsi="Futura Medium" w:cs="Futura Medium" w:hint="cs"/>
+          <w:sz w:val="22"/>
+          <w:szCs w:val="22"/>
+          <w:lang w:val="en-GB"/>
+        </w:rPr>
+        <w:t xml:space="preserve">in </w:t>
       </w:r>
       <w:r>
         <w:rPr>
@@ -1338,16 +1677,46 @@
           <w:szCs w:val="22"/>
           <w:lang w:val="en-GB"/>
         </w:rPr>
-        <w:t>were also excluded.</w:t>
-      </w:r>
-      <w:r>
-        <w:rPr>
-          <w:rFonts w:ascii="Futura Medium" w:hAnsi="Futura Medium" w:cs="Futura Medium" w:hint="cs"/>
-          <w:sz w:val="22"/>
-          <w:szCs w:val="22"/>
-          <w:lang w:val="en-GB"/>
-        </w:rPr>
-        <w:t xml:space="preserve"> Calorific value was used because quite similar to dry matter absorption </w:t>
+        <w:t>were</w:t>
+      </w:r>
+      <w:proofErr w:type="gramEnd"/>
+      <w:r>
+        <w:rPr>
+          <w:rFonts w:ascii="Futura Medium" w:hAnsi="Futura Medium" w:cs="Futura Medium" w:hint="cs"/>
+          <w:sz w:val="22"/>
+          <w:szCs w:val="22"/>
+          <w:lang w:val="en-GB"/>
+        </w:rPr>
+        <w:t xml:space="preserve"> also excluded.</w:t>
+      </w:r>
+      <w:r>
+        <w:rPr>
+          <w:rFonts w:ascii="Futura Medium" w:hAnsi="Futura Medium" w:cs="Futura Medium" w:hint="cs"/>
+          <w:sz w:val="22"/>
+          <w:szCs w:val="22"/>
+          <w:lang w:val="en-GB"/>
+        </w:rPr>
+        <w:t xml:space="preserve"> Calorific value was used because quite </w:t>
+      </w:r>
+      <w:proofErr w:type="gramStart"/>
+      <w:r>
+        <w:rPr>
+          <w:rFonts w:ascii="Futura Medium" w:hAnsi="Futura Medium" w:cs="Futura Medium" w:hint="cs"/>
+          <w:sz w:val="22"/>
+          <w:szCs w:val="22"/>
+          <w:lang w:val="en-GB"/>
+        </w:rPr>
+        <w:t>similar to</w:t>
+      </w:r>
+      <w:proofErr w:type="gramEnd"/>
+      <w:r>
+        <w:rPr>
+          <w:rFonts w:ascii="Futura Medium" w:hAnsi="Futura Medium" w:cs="Futura Medium" w:hint="cs"/>
+          <w:sz w:val="22"/>
+          <w:szCs w:val="22"/>
+          <w:lang w:val="en-GB"/>
+        </w:rPr>
+        <w:t xml:space="preserve"> dry matter absorption </w:t>
       </w:r>
       <w:r>
         <w:rPr>
@@ -1610,7 +1979,27 @@
           <w:szCs w:val="22"/>
           <w:lang w:val="en-GB"/>
         </w:rPr>
-        <w:t>Faecal production {Sonnenholzner-Varas et al., 2019, #89930}</w:t>
+        <w:t>Faecal production {</w:t>
+      </w:r>
+      <w:proofErr w:type="spellStart"/>
+      <w:r>
+        <w:rPr>
+          <w:rFonts w:ascii="Futura Medium" w:hAnsi="Futura Medium" w:cs="Futura Medium" w:hint="cs"/>
+          <w:sz w:val="22"/>
+          <w:szCs w:val="22"/>
+          <w:lang w:val="en-GB"/>
+        </w:rPr>
+        <w:t>Sonnenholzner</w:t>
+      </w:r>
+      <w:proofErr w:type="spellEnd"/>
+      <w:r>
+        <w:rPr>
+          <w:rFonts w:ascii="Futura Medium" w:hAnsi="Futura Medium" w:cs="Futura Medium" w:hint="cs"/>
+          <w:sz w:val="22"/>
+          <w:szCs w:val="22"/>
+          <w:lang w:val="en-GB"/>
+        </w:rPr>
+        <w:t>-Varas et al., 2019, #89930}</w:t>
       </w:r>
     </w:p>
     <w:p>
@@ -1641,7 +2030,27 @@
           <w:szCs w:val="22"/>
           <w:lang w:val="en-GB"/>
         </w:rPr>
-        <w:t>90% of carbon absorbed {Farmafarmaian and Phillips, 1962, #107824}</w:t>
+        <w:t>90% of carbon absorbed {</w:t>
+      </w:r>
+      <w:proofErr w:type="spellStart"/>
+      <w:r>
+        <w:rPr>
+          <w:rFonts w:ascii="Futura Medium" w:hAnsi="Futura Medium" w:cs="Futura Medium" w:hint="cs"/>
+          <w:sz w:val="22"/>
+          <w:szCs w:val="22"/>
+          <w:lang w:val="en-GB"/>
+        </w:rPr>
+        <w:t>Farmafarmaian</w:t>
+      </w:r>
+      <w:proofErr w:type="spellEnd"/>
+      <w:r>
+        <w:rPr>
+          <w:rFonts w:ascii="Futura Medium" w:hAnsi="Futura Medium" w:cs="Futura Medium" w:hint="cs"/>
+          <w:sz w:val="22"/>
+          <w:szCs w:val="22"/>
+          <w:lang w:val="en-GB"/>
+        </w:rPr>
+        <w:t xml:space="preserve"> and Phillips, 1962, #107824}</w:t>
       </w:r>
     </w:p>
     <w:p>
@@ -1715,7 +2124,27 @@
           <w:szCs w:val="22"/>
           <w:lang w:val="en-GB"/>
         </w:rPr>
-        <w:t>Increased calorific value {Dethier et al., 2019, #28250}</w:t>
+        <w:t>Increased calorific value {</w:t>
+      </w:r>
+      <w:proofErr w:type="spellStart"/>
+      <w:r>
+        <w:rPr>
+          <w:rFonts w:ascii="Futura Medium" w:hAnsi="Futura Medium" w:cs="Futura Medium" w:hint="cs"/>
+          <w:sz w:val="22"/>
+          <w:szCs w:val="22"/>
+          <w:lang w:val="en-GB"/>
+        </w:rPr>
+        <w:t>Dethier</w:t>
+      </w:r>
+      <w:proofErr w:type="spellEnd"/>
+      <w:r>
+        <w:rPr>
+          <w:rFonts w:ascii="Futura Medium" w:hAnsi="Futura Medium" w:cs="Futura Medium" w:hint="cs"/>
+          <w:sz w:val="22"/>
+          <w:szCs w:val="22"/>
+          <w:lang w:val="en-GB"/>
+        </w:rPr>
+        <w:t xml:space="preserve"> et al., 2019, #28250}</w:t>
       </w:r>
     </w:p>
     <w:p>
@@ -1807,25 +2236,145 @@
           <w:szCs w:val="22"/>
           <w:lang w:val="en-GB"/>
         </w:rPr>
-        <w:t>Decreased carbon {Dethier et al., 2019, #28250}{Bedford and Moore, 1985, #46780}</w:t>
-      </w:r>
-      <w:r>
-        <w:rPr>
-          <w:rFonts w:ascii="Futura Medium" w:hAnsi="Futura Medium" w:cs="Futura Medium" w:hint="cs"/>
-          <w:sz w:val="22"/>
-          <w:szCs w:val="22"/>
-          <w:lang w:val="en-GB"/>
-        </w:rPr>
-        <w:t>{Sauchyn and Scheibling, 2009, #82871}</w:t>
-      </w:r>
-      <w:r>
-        <w:rPr>
-          <w:rFonts w:ascii="Futura Medium" w:hAnsi="Futura Medium" w:cs="Futura Medium" w:hint="cs"/>
-          <w:sz w:val="22"/>
-          <w:szCs w:val="22"/>
-          <w:lang w:val="en-GB"/>
-        </w:rPr>
-        <w:t>{Sauchyn and Scheibling, 2009, #84657}</w:t>
+        <w:t>Decreased carbon {</w:t>
+      </w:r>
+      <w:proofErr w:type="spellStart"/>
+      <w:r>
+        <w:rPr>
+          <w:rFonts w:ascii="Futura Medium" w:hAnsi="Futura Medium" w:cs="Futura Medium" w:hint="cs"/>
+          <w:sz w:val="22"/>
+          <w:szCs w:val="22"/>
+          <w:lang w:val="en-GB"/>
+        </w:rPr>
+        <w:t>Dethier</w:t>
+      </w:r>
+      <w:proofErr w:type="spellEnd"/>
+      <w:r>
+        <w:rPr>
+          <w:rFonts w:ascii="Futura Medium" w:hAnsi="Futura Medium" w:cs="Futura Medium" w:hint="cs"/>
+          <w:sz w:val="22"/>
+          <w:szCs w:val="22"/>
+          <w:lang w:val="en-GB"/>
+        </w:rPr>
+        <w:t xml:space="preserve"> et al., 2019, #</w:t>
+      </w:r>
+      <w:proofErr w:type="gramStart"/>
+      <w:r>
+        <w:rPr>
+          <w:rFonts w:ascii="Futura Medium" w:hAnsi="Futura Medium" w:cs="Futura Medium" w:hint="cs"/>
+          <w:sz w:val="22"/>
+          <w:szCs w:val="22"/>
+          <w:lang w:val="en-GB"/>
+        </w:rPr>
+        <w:t>28250}{</w:t>
+      </w:r>
+      <w:proofErr w:type="gramEnd"/>
+      <w:r>
+        <w:rPr>
+          <w:rFonts w:ascii="Futura Medium" w:hAnsi="Futura Medium" w:cs="Futura Medium" w:hint="cs"/>
+          <w:sz w:val="22"/>
+          <w:szCs w:val="22"/>
+          <w:lang w:val="en-GB"/>
+        </w:rPr>
+        <w:t>Bedford and Moore, 1985, #</w:t>
+      </w:r>
+      <w:proofErr w:type="gramStart"/>
+      <w:r>
+        <w:rPr>
+          <w:rFonts w:ascii="Futura Medium" w:hAnsi="Futura Medium" w:cs="Futura Medium" w:hint="cs"/>
+          <w:sz w:val="22"/>
+          <w:szCs w:val="22"/>
+          <w:lang w:val="en-GB"/>
+        </w:rPr>
+        <w:t>46780}</w:t>
+      </w:r>
+      <w:r>
+        <w:rPr>
+          <w:rFonts w:ascii="Futura Medium" w:hAnsi="Futura Medium" w:cs="Futura Medium" w:hint="cs"/>
+          <w:sz w:val="22"/>
+          <w:szCs w:val="22"/>
+          <w:lang w:val="en-GB"/>
+        </w:rPr>
+        <w:t>{</w:t>
+      </w:r>
+      <w:proofErr w:type="gramEnd"/>
+      <w:r>
+        <w:rPr>
+          <w:rFonts w:ascii="Futura Medium" w:hAnsi="Futura Medium" w:cs="Futura Medium" w:hint="cs"/>
+          <w:sz w:val="22"/>
+          <w:szCs w:val="22"/>
+          <w:lang w:val="en-GB"/>
+        </w:rPr>
+        <w:t xml:space="preserve">Sauchyn and </w:t>
+      </w:r>
+      <w:proofErr w:type="spellStart"/>
+      <w:r>
+        <w:rPr>
+          <w:rFonts w:ascii="Futura Medium" w:hAnsi="Futura Medium" w:cs="Futura Medium" w:hint="cs"/>
+          <w:sz w:val="22"/>
+          <w:szCs w:val="22"/>
+          <w:lang w:val="en-GB"/>
+        </w:rPr>
+        <w:t>Scheibling</w:t>
+      </w:r>
+      <w:proofErr w:type="spellEnd"/>
+      <w:r>
+        <w:rPr>
+          <w:rFonts w:ascii="Futura Medium" w:hAnsi="Futura Medium" w:cs="Futura Medium" w:hint="cs"/>
+          <w:sz w:val="22"/>
+          <w:szCs w:val="22"/>
+          <w:lang w:val="en-GB"/>
+        </w:rPr>
+        <w:t>, 2009, #</w:t>
+      </w:r>
+      <w:proofErr w:type="gramStart"/>
+      <w:r>
+        <w:rPr>
+          <w:rFonts w:ascii="Futura Medium" w:hAnsi="Futura Medium" w:cs="Futura Medium" w:hint="cs"/>
+          <w:sz w:val="22"/>
+          <w:szCs w:val="22"/>
+          <w:lang w:val="en-GB"/>
+        </w:rPr>
+        <w:t>82871}</w:t>
+      </w:r>
+      <w:r>
+        <w:rPr>
+          <w:rFonts w:ascii="Futura Medium" w:hAnsi="Futura Medium" w:cs="Futura Medium" w:hint="cs"/>
+          <w:sz w:val="22"/>
+          <w:szCs w:val="22"/>
+          <w:lang w:val="en-GB"/>
+        </w:rPr>
+        <w:t>{</w:t>
+      </w:r>
+      <w:proofErr w:type="gramEnd"/>
+      <w:r>
+        <w:rPr>
+          <w:rFonts w:ascii="Futura Medium" w:hAnsi="Futura Medium" w:cs="Futura Medium" w:hint="cs"/>
+          <w:sz w:val="22"/>
+          <w:szCs w:val="22"/>
+          <w:lang w:val="en-GB"/>
+        </w:rPr>
+        <w:t xml:space="preserve">Sauchyn and </w:t>
+      </w:r>
+      <w:proofErr w:type="spellStart"/>
+      <w:r>
+        <w:rPr>
+          <w:rFonts w:ascii="Futura Medium" w:hAnsi="Futura Medium" w:cs="Futura Medium" w:hint="cs"/>
+          <w:sz w:val="22"/>
+          <w:szCs w:val="22"/>
+          <w:lang w:val="en-GB"/>
+        </w:rPr>
+        <w:t>Scheibling</w:t>
+      </w:r>
+      <w:proofErr w:type="spellEnd"/>
+      <w:r>
+        <w:rPr>
+          <w:rFonts w:ascii="Futura Medium" w:hAnsi="Futura Medium" w:cs="Futura Medium" w:hint="cs"/>
+          <w:sz w:val="22"/>
+          <w:szCs w:val="22"/>
+          <w:lang w:val="en-GB"/>
+        </w:rPr>
+        <w:t>, 2009, #84657}</w:t>
       </w:r>
     </w:p>
     <w:p>
@@ -1922,7 +2471,27 @@
           <w:szCs w:val="22"/>
           <w:lang w:val="en-GB"/>
         </w:rPr>
-        <w:t>{Cartaxana et al., 2003, #4198}</w:t>
+        <w:t>{</w:t>
+      </w:r>
+      <w:proofErr w:type="spellStart"/>
+      <w:r>
+        <w:rPr>
+          <w:rFonts w:ascii="Futura Medium" w:hAnsi="Futura Medium" w:cs="Futura Medium" w:hint="cs"/>
+          <w:sz w:val="22"/>
+          <w:szCs w:val="22"/>
+          <w:lang w:val="en-GB"/>
+        </w:rPr>
+        <w:t>Cartaxana</w:t>
+      </w:r>
+      <w:proofErr w:type="spellEnd"/>
+      <w:r>
+        <w:rPr>
+          <w:rFonts w:ascii="Futura Medium" w:hAnsi="Futura Medium" w:cs="Futura Medium" w:hint="cs"/>
+          <w:sz w:val="22"/>
+          <w:szCs w:val="22"/>
+          <w:lang w:val="en-GB"/>
+        </w:rPr>
+        <w:t xml:space="preserve"> et al., 2003, #4198}</w:t>
       </w:r>
       <w:r>
         <w:rPr>
@@ -1977,7 +2546,27 @@
           <w:szCs w:val="22"/>
           <w:lang w:val="en-GB"/>
         </w:rPr>
-        <w:t>{Szymczak-Żyla et al., 2008, #101781}</w:t>
+        <w:t>{Szymczak-</w:t>
+      </w:r>
+      <w:proofErr w:type="spellStart"/>
+      <w:r>
+        <w:rPr>
+          <w:rFonts w:ascii="Futura Medium" w:hAnsi="Futura Medium" w:cs="Futura Medium" w:hint="cs"/>
+          <w:sz w:val="22"/>
+          <w:szCs w:val="22"/>
+          <w:lang w:val="en-GB"/>
+        </w:rPr>
+        <w:t>Żyla</w:t>
+      </w:r>
+      <w:proofErr w:type="spellEnd"/>
+      <w:r>
+        <w:rPr>
+          <w:rFonts w:ascii="Futura Medium" w:hAnsi="Futura Medium" w:cs="Futura Medium" w:hint="cs"/>
+          <w:sz w:val="22"/>
+          <w:szCs w:val="22"/>
+          <w:lang w:val="en-GB"/>
+        </w:rPr>
+        <w:t xml:space="preserve"> et al., 2008, #101781}</w:t>
       </w:r>
       <w:r>
         <w:rPr>
@@ -2007,7 +2596,27 @@
           <w:szCs w:val="22"/>
           <w:lang w:val="en-GB"/>
         </w:rPr>
-        <w:t>{Oetama et al., 2021, #45483}</w:t>
+        <w:t>{</w:t>
+      </w:r>
+      <w:proofErr w:type="spellStart"/>
+      <w:r>
+        <w:rPr>
+          <w:rFonts w:ascii="Futura Medium" w:hAnsi="Futura Medium" w:cs="Futura Medium" w:hint="cs"/>
+          <w:sz w:val="22"/>
+          <w:szCs w:val="22"/>
+          <w:lang w:val="en-GB"/>
+        </w:rPr>
+        <w:t>Oetama</w:t>
+      </w:r>
+      <w:proofErr w:type="spellEnd"/>
+      <w:r>
+        <w:rPr>
+          <w:rFonts w:ascii="Futura Medium" w:hAnsi="Futura Medium" w:cs="Futura Medium" w:hint="cs"/>
+          <w:sz w:val="22"/>
+          <w:szCs w:val="22"/>
+          <w:lang w:val="en-GB"/>
+        </w:rPr>
+        <w:t xml:space="preserve"> et al., 2021, #45483}</w:t>
       </w:r>
       <w:r>
         <w:rPr>
@@ -2022,7 +2631,27 @@
           <w:szCs w:val="22"/>
           <w:lang w:val="en-GB"/>
         </w:rPr>
-        <w:t>{Badgaa et al., 2014, #51506}</w:t>
+        <w:t>{</w:t>
+      </w:r>
+      <w:proofErr w:type="spellStart"/>
+      <w:r>
+        <w:rPr>
+          <w:rFonts w:ascii="Futura Medium" w:hAnsi="Futura Medium" w:cs="Futura Medium" w:hint="cs"/>
+          <w:sz w:val="22"/>
+          <w:szCs w:val="22"/>
+          <w:lang w:val="en-GB"/>
+        </w:rPr>
+        <w:t>Badgaa</w:t>
+      </w:r>
+      <w:proofErr w:type="spellEnd"/>
+      <w:r>
+        <w:rPr>
+          <w:rFonts w:ascii="Futura Medium" w:hAnsi="Futura Medium" w:cs="Futura Medium" w:hint="cs"/>
+          <w:sz w:val="22"/>
+          <w:szCs w:val="22"/>
+          <w:lang w:val="en-GB"/>
+        </w:rPr>
+        <w:t xml:space="preserve"> et al., 2014, #51506}</w:t>
       </w:r>
       <w:r>
         <w:rPr>
@@ -2037,7 +2666,27 @@
           <w:szCs w:val="22"/>
           <w:lang w:val="en-GB"/>
         </w:rPr>
-        <w:t>{Badgaa et al., 2015, #25606}</w:t>
+        <w:t>{</w:t>
+      </w:r>
+      <w:proofErr w:type="spellStart"/>
+      <w:r>
+        <w:rPr>
+          <w:rFonts w:ascii="Futura Medium" w:hAnsi="Futura Medium" w:cs="Futura Medium" w:hint="cs"/>
+          <w:sz w:val="22"/>
+          <w:szCs w:val="22"/>
+          <w:lang w:val="en-GB"/>
+        </w:rPr>
+        <w:t>Badgaa</w:t>
+      </w:r>
+      <w:proofErr w:type="spellEnd"/>
+      <w:r>
+        <w:rPr>
+          <w:rFonts w:ascii="Futura Medium" w:hAnsi="Futura Medium" w:cs="Futura Medium" w:hint="cs"/>
+          <w:sz w:val="22"/>
+          <w:szCs w:val="22"/>
+          <w:lang w:val="en-GB"/>
+        </w:rPr>
+        <w:t xml:space="preserve"> et al., 2015, #25606}</w:t>
       </w:r>
       <w:r>
         <w:rPr>
@@ -2052,7 +2701,27 @@
           <w:szCs w:val="22"/>
           <w:lang w:val="en-GB"/>
         </w:rPr>
-        <w:t>{Boon and Duineveld, 2012, #72438}</w:t>
+        <w:t xml:space="preserve">{Boon and </w:t>
+      </w:r>
+      <w:proofErr w:type="spellStart"/>
+      <w:r>
+        <w:rPr>
+          <w:rFonts w:ascii="Futura Medium" w:hAnsi="Futura Medium" w:cs="Futura Medium" w:hint="cs"/>
+          <w:sz w:val="22"/>
+          <w:szCs w:val="22"/>
+          <w:lang w:val="en-GB"/>
+        </w:rPr>
+        <w:t>Duineveld</w:t>
+      </w:r>
+      <w:proofErr w:type="spellEnd"/>
+      <w:r>
+        <w:rPr>
+          <w:rFonts w:ascii="Futura Medium" w:hAnsi="Futura Medium" w:cs="Futura Medium" w:hint="cs"/>
+          <w:sz w:val="22"/>
+          <w:szCs w:val="22"/>
+          <w:lang w:val="en-GB"/>
+        </w:rPr>
+        <w:t>, 2012, #72438}</w:t>
       </w:r>
       <w:r>
         <w:rPr>
@@ -2120,18 +2789,232 @@
           <w:szCs w:val="22"/>
           <w:lang w:val="en-GB"/>
         </w:rPr>
-        <w:t>Amphipod feeding {Hay et al., 1998, #27800}{Molis et al., 2010, #7542}{Hay et al., 1987, #9146}{Molis et al., 2008, #104044}{Wessels et al., 2006, #94033}</w:t>
-      </w:r>
-    </w:p>
-    <w:p>
-      <w:pPr>
-        <w:rPr>
-          <w:rFonts w:ascii="Futura Medium" w:hAnsi="Futura Medium" w:cs="Futura Medium"/>
-          <w:sz w:val="22"/>
-          <w:szCs w:val="22"/>
-          <w:lang w:val="en-GB"/>
-        </w:rPr>
-      </w:pPr>
+        <w:t>Amphipod feeding {Hay et al., 1998, #</w:t>
+      </w:r>
+      <w:proofErr w:type="gramStart"/>
+      <w:r>
+        <w:rPr>
+          <w:rFonts w:ascii="Futura Medium" w:hAnsi="Futura Medium" w:cs="Futura Medium" w:hint="cs"/>
+          <w:sz w:val="22"/>
+          <w:szCs w:val="22"/>
+          <w:lang w:val="en-GB"/>
+        </w:rPr>
+        <w:t>27800}{</w:t>
+      </w:r>
+      <w:proofErr w:type="gramEnd"/>
+      <w:r>
+        <w:rPr>
+          <w:rFonts w:ascii="Futura Medium" w:hAnsi="Futura Medium" w:cs="Futura Medium" w:hint="cs"/>
+          <w:sz w:val="22"/>
+          <w:szCs w:val="22"/>
+          <w:lang w:val="en-GB"/>
+        </w:rPr>
+        <w:t>Molis et al., 2010, #</w:t>
+      </w:r>
+      <w:proofErr w:type="gramStart"/>
+      <w:r>
+        <w:rPr>
+          <w:rFonts w:ascii="Futura Medium" w:hAnsi="Futura Medium" w:cs="Futura Medium" w:hint="cs"/>
+          <w:sz w:val="22"/>
+          <w:szCs w:val="22"/>
+          <w:lang w:val="en-GB"/>
+        </w:rPr>
+        <w:t>7542}{</w:t>
+      </w:r>
+      <w:proofErr w:type="gramEnd"/>
+      <w:r>
+        <w:rPr>
+          <w:rFonts w:ascii="Futura Medium" w:hAnsi="Futura Medium" w:cs="Futura Medium" w:hint="cs"/>
+          <w:sz w:val="22"/>
+          <w:szCs w:val="22"/>
+          <w:lang w:val="en-GB"/>
+        </w:rPr>
+        <w:t>Hay et al., 1987, #</w:t>
+      </w:r>
+      <w:proofErr w:type="gramStart"/>
+      <w:r>
+        <w:rPr>
+          <w:rFonts w:ascii="Futura Medium" w:hAnsi="Futura Medium" w:cs="Futura Medium" w:hint="cs"/>
+          <w:sz w:val="22"/>
+          <w:szCs w:val="22"/>
+          <w:lang w:val="en-GB"/>
+        </w:rPr>
+        <w:t>9146}{</w:t>
+      </w:r>
+      <w:proofErr w:type="gramEnd"/>
+      <w:r>
+        <w:rPr>
+          <w:rFonts w:ascii="Futura Medium" w:hAnsi="Futura Medium" w:cs="Futura Medium" w:hint="cs"/>
+          <w:sz w:val="22"/>
+          <w:szCs w:val="22"/>
+          <w:lang w:val="en-GB"/>
+        </w:rPr>
+        <w:t>Molis et al., 2008, #</w:t>
+      </w:r>
+      <w:proofErr w:type="gramStart"/>
+      <w:r>
+        <w:rPr>
+          <w:rFonts w:ascii="Futura Medium" w:hAnsi="Futura Medium" w:cs="Futura Medium" w:hint="cs"/>
+          <w:sz w:val="22"/>
+          <w:szCs w:val="22"/>
+          <w:lang w:val="en-GB"/>
+        </w:rPr>
+        <w:t>104044}{</w:t>
+      </w:r>
+      <w:proofErr w:type="gramEnd"/>
+      <w:r>
+        <w:rPr>
+          <w:rFonts w:ascii="Futura Medium" w:hAnsi="Futura Medium" w:cs="Futura Medium" w:hint="cs"/>
+          <w:sz w:val="22"/>
+          <w:szCs w:val="22"/>
+          <w:lang w:val="en-GB"/>
+        </w:rPr>
+        <w:t>Wessels et al., 2006, #94033}</w:t>
+      </w:r>
+    </w:p>
+    <w:p>
+      <w:pPr>
+        <w:rPr>
+          <w:rFonts w:ascii="Futura Medium" w:hAnsi="Futura Medium" w:cs="Futura Medium"/>
+          <w:sz w:val="22"/>
+          <w:szCs w:val="22"/>
+          <w:lang w:val="en-GB"/>
+        </w:rPr>
+      </w:pPr>
+    </w:p>
+    <w:p>
+      <w:pPr>
+        <w:rPr>
+          <w:rFonts w:ascii="Futura Medium" w:hAnsi="Futura Medium" w:cs="Futura Medium"/>
+          <w:sz w:val="22"/>
+          <w:szCs w:val="22"/>
+          <w:lang w:val="en-GB"/>
+        </w:rPr>
+      </w:pPr>
+      <w:r>
+        <w:rPr>
+          <w:rFonts w:ascii="Futura Medium" w:hAnsi="Futura Medium" w:cs="Futura Medium"/>
+          <w:sz w:val="22"/>
+          <w:szCs w:val="22"/>
+          <w:lang w:val="en-GB"/>
+        </w:rPr>
+        <w:t xml:space="preserve">Composition of diet affects feeding </w:t>
+      </w:r>
+      <w:r>
+        <w:rPr>
+          <w:rFonts w:ascii="Futura Medium" w:hAnsi="Futura Medium" w:cs="Futura Medium"/>
+          <w:sz w:val="22"/>
+          <w:szCs w:val="22"/>
+          <w:lang w:val="en-GB"/>
+        </w:rPr>
+        <w:t xml:space="preserve">{Lyons and </w:t>
+      </w:r>
+      <w:proofErr w:type="spellStart"/>
+      <w:r>
+        <w:rPr>
+          <w:rFonts w:ascii="Futura Medium" w:hAnsi="Futura Medium" w:cs="Futura Medium"/>
+          <w:sz w:val="22"/>
+          <w:szCs w:val="22"/>
+          <w:lang w:val="en-GB"/>
+        </w:rPr>
+        <w:t>Scheibling</w:t>
+      </w:r>
+      <w:proofErr w:type="spellEnd"/>
+      <w:r>
+        <w:rPr>
+          <w:rFonts w:ascii="Futura Medium" w:hAnsi="Futura Medium" w:cs="Futura Medium"/>
+          <w:sz w:val="22"/>
+          <w:szCs w:val="22"/>
+          <w:lang w:val="en-GB"/>
+        </w:rPr>
+        <w:t>, 2007, #68156}</w:t>
+      </w:r>
+    </w:p>
+    <w:p>
+      <w:pPr>
+        <w:rPr>
+          <w:rFonts w:ascii="Futura Medium" w:hAnsi="Futura Medium" w:cs="Futura Medium"/>
+          <w:sz w:val="22"/>
+          <w:szCs w:val="22"/>
+          <w:lang w:val="en-GB"/>
+        </w:rPr>
+      </w:pPr>
+    </w:p>
+    <w:p>
+      <w:pPr>
+        <w:rPr>
+          <w:rFonts w:ascii="Futura Medium" w:hAnsi="Futura Medium" w:cs="Futura Medium"/>
+          <w:sz w:val="22"/>
+          <w:szCs w:val="22"/>
+          <w:lang w:val="en-GB"/>
+        </w:rPr>
+      </w:pPr>
+      <w:r>
+        <w:rPr>
+          <w:rFonts w:ascii="Futura Medium" w:hAnsi="Futura Medium" w:cs="Futura Medium"/>
+          <w:sz w:val="22"/>
+          <w:szCs w:val="22"/>
+          <w:lang w:val="en-GB"/>
+        </w:rPr>
+        <w:t xml:space="preserve">Carbon incorporation measured directly </w:t>
+      </w:r>
+      <w:r>
+        <w:rPr>
+          <w:rFonts w:ascii="Futura Medium" w:hAnsi="Futura Medium" w:cs="Futura Medium"/>
+          <w:sz w:val="22"/>
+          <w:szCs w:val="22"/>
+          <w:lang w:val="en-GB"/>
+        </w:rPr>
+        <w:t>{</w:t>
+      </w:r>
+      <w:proofErr w:type="spellStart"/>
+      <w:r>
+        <w:rPr>
+          <w:rFonts w:ascii="Futura Medium" w:hAnsi="Futura Medium" w:cs="Futura Medium"/>
+          <w:sz w:val="22"/>
+          <w:szCs w:val="22"/>
+          <w:lang w:val="en-GB"/>
+        </w:rPr>
+        <w:t>Farmafarmaian</w:t>
+      </w:r>
+      <w:proofErr w:type="spellEnd"/>
+      <w:r>
+        <w:rPr>
+          <w:rFonts w:ascii="Futura Medium" w:hAnsi="Futura Medium" w:cs="Futura Medium"/>
+          <w:sz w:val="22"/>
+          <w:szCs w:val="22"/>
+          <w:lang w:val="en-GB"/>
+        </w:rPr>
+        <w:t xml:space="preserve"> and Phillips, 1962, #107824}</w:t>
+      </w:r>
+    </w:p>
+    <w:p>
+      <w:pPr>
+        <w:rPr>
+          <w:rFonts w:ascii="Futura Medium" w:hAnsi="Futura Medium" w:cs="Futura Medium"/>
+          <w:sz w:val="22"/>
+          <w:szCs w:val="22"/>
+          <w:lang w:val="en-GB"/>
+        </w:rPr>
+      </w:pPr>
+      <w:r>
+        <w:rPr>
+          <w:rFonts w:ascii="Futura Medium" w:hAnsi="Futura Medium" w:cs="Futura Medium"/>
+          <w:sz w:val="22"/>
+          <w:szCs w:val="22"/>
+          <w:lang w:val="en-GB"/>
+        </w:rPr>
+        <w:t xml:space="preserve">Urchins remove mannitol laminarin etc </w:t>
+      </w:r>
+      <w:r>
+        <w:rPr>
+          <w:rFonts w:ascii="Futura Medium" w:hAnsi="Futura Medium" w:cs="Futura Medium"/>
+          <w:sz w:val="22"/>
+          <w:szCs w:val="22"/>
+          <w:lang w:val="en-GB"/>
+        </w:rPr>
+        <w:t>{Yano, 1993, #4245}</w:t>
+      </w:r>
     </w:p>
     <w:sectPr>
       <w:pgSz w:w="11906" w:h="16838"/>

</xml_diff>